<commit_message>
Documentação SA - 2
Atualizado a documentação da SA, adicionando a introdução.
</commit_message>
<xml_diff>
--- a/Mod_Doc_SA - Desenv_Sistemas - Guilherme Pacheco - Lucas Rezende - Eduarda.docx
+++ b/Mod_Doc_SA - Desenv_Sistemas - Guilherme Pacheco - Lucas Rezende - Eduarda.docx
@@ -465,35 +465,47 @@
         <w:rPr>
           <w:sz w:val="24"/>
         </w:rPr>
-        <w:t xml:space="preserve">Orientador: </w:t>
-      </w:r>
-      <w:r>
-        <w:rPr>
-          <w:color w:val="FF0000"/>
+        <w:t>Orientador</w:t>
+      </w:r>
+      <w:r>
+        <w:rPr>
           <w:sz w:val="24"/>
         </w:rPr>
-        <w:t xml:space="preserve">Prof. </w:t>
-      </w:r>
-      <w:r>
-        <w:rPr>
-          <w:color w:val="FF0000"/>
+        <w:t>es</w:t>
+      </w:r>
+      <w:r>
+        <w:rPr>
           <w:sz w:val="24"/>
         </w:rPr>
-        <w:t xml:space="preserve">Nome do </w:t>
-      </w:r>
-      <w:r>
-        <w:rPr>
-          <w:color w:val="FF0000"/>
+        <w:t xml:space="preserve">: </w:t>
+      </w:r>
+      <w:proofErr w:type="spellStart"/>
+      <w:r>
+        <w:rPr>
           <w:sz w:val="24"/>
         </w:rPr>
-        <w:t>O</w:t>
-      </w:r>
-      <w:r>
-        <w:rPr>
-          <w:color w:val="FF0000"/>
+        <w:t>Alann</w:t>
+      </w:r>
+      <w:proofErr w:type="spellEnd"/>
+      <w:r>
+        <w:rPr>
           <w:sz w:val="24"/>
         </w:rPr>
-        <w:t>rientador</w:t>
+        <w:t xml:space="preserve"> Kelly </w:t>
+      </w:r>
+      <w:proofErr w:type="spellStart"/>
+      <w:r>
+        <w:rPr>
+          <w:sz w:val="24"/>
+        </w:rPr>
+        <w:t>Pirchiner</w:t>
+      </w:r>
+      <w:proofErr w:type="spellEnd"/>
+      <w:r>
+        <w:rPr>
+          <w:sz w:val="24"/>
+        </w:rPr>
+        <w:t xml:space="preserve"> Perini e Sergio Luiz da Silveira</w:t>
       </w:r>
     </w:p>
     <w:p>
@@ -954,12 +966,6 @@
           <w:rFonts w:cs="Arial"/>
         </w:rPr>
       </w:pPr>
-      <w:r>
-        <w:rPr>
-          <w:rFonts w:cs="Arial"/>
-        </w:rPr>
-        <w:t>Assinatura do orientador</w:t>
-      </w:r>
     </w:p>
     <w:p>
       <w:pPr>
@@ -996,7 +1002,13 @@
         <w:rPr>
           <w:rFonts w:cs="Arial"/>
         </w:rPr>
-        <w:t>Prof. (orientador)</w:t>
+        <w:t xml:space="preserve">Prof. </w:t>
+      </w:r>
+      <w:r>
+        <w:rPr>
+          <w:rFonts w:cs="Arial"/>
+        </w:rPr>
+        <w:t>Sergio Luiz da Silveira</w:t>
       </w:r>
     </w:p>
     <w:p>
@@ -1027,6 +1039,19 @@
     </w:p>
     <w:p>
       <w:pPr>
+        <w:autoSpaceDE w:val="0"/>
+        <w:autoSpaceDN w:val="0"/>
+        <w:adjustRightInd w:val="0"/>
+        <w:spacing w:line="240" w:lineRule="auto"/>
+        <w:ind w:firstLine="0"/>
+        <w:jc w:val="center"/>
+        <w:rPr>
+          <w:rFonts w:cs="Arial"/>
+        </w:rPr>
+      </w:pPr>
+    </w:p>
+    <w:p>
+      <w:pPr>
         <w:pStyle w:val="NotadeMonografia"/>
         <w:tabs>
           <w:tab w:val="left" w:pos="5940"/>
@@ -1060,19 +1085,41 @@
         <w:rPr>
           <w:rFonts w:cs="Arial"/>
         </w:rPr>
-        <w:t>Prof.</w:t>
-      </w:r>
-      <w:r>
-        <w:rPr>
-          <w:rFonts w:cs="Arial"/>
-        </w:rPr>
-        <w:t>(Nome)</w:t>
-      </w:r>
-      <w:r>
-        <w:rPr>
-          <w:rFonts w:cs="Arial"/>
-        </w:rPr>
-        <w:t xml:space="preserve"> - Membro</w:t>
+        <w:t>Prof</w:t>
+      </w:r>
+      <w:r>
+        <w:rPr>
+          <w:rFonts w:cs="Arial"/>
+        </w:rPr>
+        <w:t xml:space="preserve">. </w:t>
+      </w:r>
+      <w:proofErr w:type="spellStart"/>
+      <w:r>
+        <w:rPr>
+          <w:rFonts w:cs="Arial"/>
+        </w:rPr>
+        <w:t>Alann</w:t>
+      </w:r>
+      <w:proofErr w:type="spellEnd"/>
+      <w:r>
+        <w:rPr>
+          <w:rFonts w:cs="Arial"/>
+        </w:rPr>
+        <w:t xml:space="preserve"> Kelly </w:t>
+      </w:r>
+      <w:proofErr w:type="spellStart"/>
+      <w:r>
+        <w:rPr>
+          <w:rFonts w:cs="Arial"/>
+        </w:rPr>
+        <w:t>Pirchiner</w:t>
+      </w:r>
+      <w:proofErr w:type="spellEnd"/>
+      <w:r>
+        <w:rPr>
+          <w:rFonts w:cs="Arial"/>
+        </w:rPr>
+        <w:t xml:space="preserve"> Perini</w:t>
       </w:r>
     </w:p>
     <w:p>
@@ -1113,12 +1160,6 @@
           <w:rFonts w:cs="Arial"/>
         </w:rPr>
       </w:pPr>
-      <w:r>
-        <w:rPr>
-          <w:rFonts w:cs="Arial"/>
-        </w:rPr>
-        <w:t>Assinatura do professor</w:t>
-      </w:r>
     </w:p>
     <w:p>
       <w:pPr>
@@ -1161,13 +1202,7 @@
         <w:rPr>
           <w:rFonts w:cs="Arial"/>
         </w:rPr>
-        <w:t>(Nome)</w:t>
-      </w:r>
-      <w:r>
-        <w:rPr>
-          <w:rFonts w:cs="Arial"/>
-        </w:rPr>
-        <w:t xml:space="preserve"> - Membro</w:t>
+        <w:t>Camilla Damiani</w:t>
       </w:r>
     </w:p>
     <w:p>
@@ -1228,7 +1263,6 @@
         <w:rPr>
           <w:b/>
           <w:bCs/>
-          <w:color w:val="FF0000"/>
           <w:sz w:val="24"/>
         </w:rPr>
         <w:sectPr>
@@ -1245,7 +1279,6 @@
         <w:rPr>
           <w:b/>
           <w:bCs/>
-          <w:color w:val="FF0000"/>
           <w:sz w:val="24"/>
         </w:rPr>
         <w:t>Joinville</w:t>
@@ -1254,7 +1287,6 @@
         <w:rPr>
           <w:b/>
           <w:bCs/>
-          <w:color w:val="FF0000"/>
           <w:sz w:val="24"/>
         </w:rPr>
         <w:t xml:space="preserve">, </w:t>
@@ -1263,7 +1295,6 @@
         <w:rPr>
           <w:b/>
           <w:bCs/>
-          <w:color w:val="FF0000"/>
           <w:sz w:val="24"/>
         </w:rPr>
         <w:t>11</w:t>
@@ -1272,7 +1303,6 @@
         <w:rPr>
           <w:b/>
           <w:bCs/>
-          <w:color w:val="FF0000"/>
           <w:sz w:val="24"/>
         </w:rPr>
         <w:t xml:space="preserve"> de </w:t>
@@ -1281,7 +1311,6 @@
         <w:rPr>
           <w:b/>
           <w:bCs/>
-          <w:color w:val="FF0000"/>
           <w:sz w:val="24"/>
         </w:rPr>
         <w:t>março</w:t>
@@ -1290,7 +1319,6 @@
         <w:rPr>
           <w:b/>
           <w:bCs/>
-          <w:color w:val="FF0000"/>
           <w:sz w:val="24"/>
         </w:rPr>
         <w:t xml:space="preserve"> de 20</w:t>
@@ -1299,7 +1327,6 @@
         <w:rPr>
           <w:b/>
           <w:bCs/>
-          <w:color w:val="FF0000"/>
           <w:sz w:val="24"/>
         </w:rPr>
         <w:t>2</w:t>
@@ -1308,7 +1335,6 @@
         <w:rPr>
           <w:b/>
           <w:bCs/>
-          <w:color w:val="FF0000"/>
           <w:sz w:val="24"/>
         </w:rPr>
         <w:t>6</w:t>
@@ -1317,7 +1343,6 @@
         <w:rPr>
           <w:b/>
           <w:bCs/>
-          <w:color w:val="FF0000"/>
           <w:sz w:val="24"/>
         </w:rPr>
         <w:t>.</w:t>
@@ -1945,55 +1970,7 @@
         <w:ind w:firstLine="0"/>
       </w:pPr>
       <w:r>
-        <w:t>Os sistemas de informação têm se tornado ferramentas essenciais para a organização</w:t>
-      </w:r>
-      <w:r>
-        <w:t xml:space="preserve"> das empresas</w:t>
-      </w:r>
-      <w:r>
-        <w:t xml:space="preserve">, permitindo maior controle de dados, agilidade nos processos e melhor tomada de decisão. No setor de </w:t>
-      </w:r>
-      <w:r>
-        <w:t>padarias e panificadoras</w:t>
-      </w:r>
-      <w:r>
-        <w:t>, a utilização de</w:t>
-      </w:r>
-      <w:r>
-        <w:t>stes</w:t>
-      </w:r>
-      <w:r>
-        <w:t xml:space="preserve"> sistemas auxilia no gerenciamento de informações relacionadas a funcionários, fornecedores e produtos, contribuindo para a eficiência administrativa e operacional do estabelecimento. O objetivo deste trabalho é desenvolver um sistema de cadastro para uma padaria</w:t>
-      </w:r>
-      <w:r>
-        <w:t xml:space="preserve"> e panificadora</w:t>
-      </w:r>
-      <w:r>
-        <w:t xml:space="preserve">, permitindo o registro, organização e consulta de dados de funcionários, fornecedores e produtos, além de apresentar uma interface simples e funcional para facilitar o uso do sistema pelos usuários. A metodologia utilizada </w:t>
-      </w:r>
-      <w:r>
-        <w:t>tem base</w:t>
-      </w:r>
-      <w:r>
-        <w:t xml:space="preserve"> no desenvolvimento de um sistema </w:t>
-      </w:r>
-      <w:r>
-        <w:t xml:space="preserve">com interface que </w:t>
-      </w:r>
-      <w:r>
-        <w:t>utiliz</w:t>
-      </w:r>
-      <w:r>
-        <w:t>e</w:t>
-      </w:r>
-      <w:r>
-        <w:t xml:space="preserve"> ferramentas de programação e banco de dados para armazenar e gerenciar as informações cadastradas. Foram definidos requisitos funcionais e não funcionais</w:t>
-      </w:r>
-      <w:r>
-        <w:t xml:space="preserve"> e</w:t>
-      </w:r>
-      <w:r>
-        <w:t xml:space="preserve"> a modelagem do sistema por meio de diagramas que representam a estrutura e funcionamento da aplicação. Como resultado, foi desenvolvido um sistema capaz de realizar o cadastro, edição, exclusão e consulta de informações relacionadas aos funcionários, fornecedores e produtos da padaria. A interface do sistema foi projetada de forma intuitiva, permitindo que os usuários realizem as operações de forma rápida e organizada. O sistema desenvolvido apresenta potencial para otimizar a administração da padaria e pode ser ampliado futuramente com novas funcionalidades</w:t>
+        <w:t>Os sistemas de informação têm se tornado ferramentas essenciais para a organização das empresas, permitindo maior controle de dados, agilidade nos processos e melhor tomada de decisão. No setor de padarias e panificadoras, a utilização destes sistemas auxilia no gerenciamento de informações relacionadas a funcionários, fornecedores e produtos, contribuindo para a eficiência administrativa e operacional do estabelecimento. O objetivo deste trabalho é desenvolver um sistema de cadastro para uma padaria e panificadora, permitindo o registro, organização e consulta de dados de funcionários, fornecedores e produtos, além de apresentar uma interface simples e funcional para facilitar o uso do sistema pelos usuários. A metodologia utilizada tem base no desenvolvimento de um sistema com interface que utilize ferramentas de programação e banco de dados para armazenar e gerenciar as informações cadastradas. Foram definidos requisitos funcionais e não funcionais e a modelagem do sistema por meio de diagramas que representam a estrutura e funcionamento da aplicação. Como resultado, foi desenvolvido um sistema capaz de realizar o cadastro, edição, exclusão e consulta de informações relacionadas aos funcionários, fornecedores e produtos da padaria. A interface do sistema foi projetada de forma intuitiva, permitindo que os usuários realizem as operações de forma rápida e organizada. O sistema desenvolvido apresenta potencial para otimizar a administração da padaria e pode ser ampliado futuramente com novas funcionalidades</w:t>
       </w:r>
       <w:r>
         <w:t>.</w:t>
@@ -2040,513 +2017,24 @@
     </w:p>
     <w:p>
       <w:pPr>
-        <w:spacing w:line="240" w:lineRule="auto"/>
-        <w:rPr>
-          <w:b/>
-          <w:bCs/>
-          <w:spacing w:val="-15"/>
-        </w:rPr>
-      </w:pPr>
-    </w:p>
-    <w:p>
-      <w:pPr>
-        <w:spacing w:line="240" w:lineRule="auto"/>
-        <w:ind w:firstLine="0"/>
-      </w:pPr>
-      <w:r>
-        <w:rPr>
-          <w:b/>
-          <w:bCs/>
-          <w:spacing w:val="-15"/>
-        </w:rPr>
-        <w:t>Orientações</w:t>
-      </w:r>
-      <w:r>
-        <w:rPr>
-          <w:bCs/>
-          <w:spacing w:val="-15"/>
-        </w:rPr>
-        <w:t>: Veja que no resumo são descritos a introdução e justificativa</w:t>
-      </w:r>
-      <w:r>
-        <w:rPr>
-          <w:bCs/>
-          <w:spacing w:val="-15"/>
-        </w:rPr>
-        <w:t xml:space="preserve"> </w:t>
-      </w:r>
-      <w:r>
-        <w:rPr>
-          <w:b/>
-          <w:bCs/>
-        </w:rPr>
-        <w:t>(</w:t>
-      </w:r>
-      <w:r>
-        <w:rPr>
-          <w:b/>
-          <w:bCs/>
-          <w:color w:val="FF0000"/>
-        </w:rPr>
-        <w:t>VERMELHO</w:t>
-      </w:r>
-      <w:r>
-        <w:rPr>
-          <w:b/>
-          <w:bCs/>
-          <w:spacing w:val="-15"/>
-        </w:rPr>
-        <w:t xml:space="preserve">), </w:t>
-      </w:r>
-      <w:r>
-        <w:rPr>
-          <w:bCs/>
-          <w:spacing w:val="-15"/>
-        </w:rPr>
-        <w:t xml:space="preserve">o objetivo </w:t>
-      </w:r>
-      <w:r>
-        <w:rPr>
-          <w:b/>
-          <w:bCs/>
-          <w:spacing w:val="-15"/>
-        </w:rPr>
-        <w:t>(</w:t>
-      </w:r>
-      <w:r>
-        <w:rPr>
-          <w:b/>
-          <w:bCs/>
-          <w:color w:val="548DD4"/>
-          <w:spacing w:val="-15"/>
-        </w:rPr>
-        <w:t>AZUL</w:t>
-      </w:r>
-      <w:r>
-        <w:rPr>
-          <w:b/>
-          <w:bCs/>
-          <w:spacing w:val="-15"/>
-        </w:rPr>
-        <w:t xml:space="preserve">), </w:t>
-      </w:r>
-      <w:r>
-        <w:rPr>
-          <w:bCs/>
-          <w:spacing w:val="-15"/>
-        </w:rPr>
-        <w:t>Metodologia</w:t>
-      </w:r>
-      <w:r>
-        <w:rPr>
-          <w:b/>
-          <w:bCs/>
-          <w:spacing w:val="-15"/>
-        </w:rPr>
-        <w:t xml:space="preserve"> (</w:t>
-      </w:r>
-      <w:r>
-        <w:rPr>
-          <w:b/>
-          <w:bCs/>
-          <w:color w:val="4F6228"/>
-        </w:rPr>
-        <w:t>VERDE</w:t>
-      </w:r>
-      <w:r>
-        <w:rPr>
-          <w:b/>
-          <w:bCs/>
-          <w:spacing w:val="-15"/>
-        </w:rPr>
-        <w:t xml:space="preserve">), </w:t>
-      </w:r>
-      <w:r>
-        <w:rPr>
-          <w:bCs/>
-          <w:spacing w:val="-15"/>
-        </w:rPr>
-        <w:t>resultados e conclusões</w:t>
-      </w:r>
-      <w:r>
-        <w:t xml:space="preserve"> </w:t>
-      </w:r>
-      <w:r>
-        <w:rPr>
-          <w:b/>
-          <w:bCs/>
-        </w:rPr>
-        <w:t>(</w:t>
-      </w:r>
-      <w:r>
-        <w:rPr>
-          <w:b/>
-          <w:bCs/>
-          <w:color w:val="7030A0"/>
-        </w:rPr>
-        <w:t>ROXO</w:t>
-      </w:r>
-      <w:r>
-        <w:rPr>
-          <w:b/>
-          <w:bCs/>
-        </w:rPr>
-        <w:t>).</w:t>
-      </w:r>
-    </w:p>
-    <w:p>
-      <w:pPr>
-        <w:spacing w:line="240" w:lineRule="auto"/>
-        <w:ind w:firstLine="0"/>
-      </w:pPr>
-    </w:p>
-    <w:p>
-      <w:pPr>
-        <w:spacing w:line="240" w:lineRule="auto"/>
-        <w:ind w:firstLine="0"/>
-      </w:pPr>
-    </w:p>
-    <w:p>
-      <w:pPr>
-        <w:spacing w:line="240" w:lineRule="auto"/>
-        <w:ind w:firstLine="0"/>
-      </w:pPr>
-    </w:p>
-    <w:p>
-      <w:pPr>
-        <w:autoSpaceDE w:val="0"/>
-        <w:autoSpaceDN w:val="0"/>
-        <w:adjustRightInd w:val="0"/>
         <w:spacing w:line="240" w:lineRule="auto"/>
         <w:ind w:firstLine="0"/>
         <w:jc w:val="left"/>
         <w:rPr>
           <w:rFonts w:cs="Arial"/>
-          <w:color w:val="FF0000"/>
-        </w:rPr>
-      </w:pPr>
-      <w:r>
-        <w:rPr>
-          <w:rFonts w:cs="Arial"/>
-          <w:color w:val="FF0000"/>
-        </w:rPr>
-        <w:t>Para elaboração do resumo deve-se observar:</w:t>
-      </w:r>
-    </w:p>
-    <w:p>
-      <w:pPr>
-        <w:autoSpaceDE w:val="0"/>
-        <w:autoSpaceDN w:val="0"/>
-        <w:adjustRightInd w:val="0"/>
-        <w:spacing w:line="240" w:lineRule="auto"/>
-        <w:ind w:firstLine="0"/>
-        <w:jc w:val="left"/>
-        <w:rPr>
-          <w:rFonts w:cs="Arial"/>
-          <w:color w:val="FF0000"/>
-        </w:rPr>
-      </w:pPr>
-      <w:r>
-        <w:rPr>
-          <w:rFonts w:ascii="Symbol" w:hAnsi="Symbol" w:cs="Symbol"/>
-          <w:color w:val="FF0000"/>
-        </w:rPr>
-        <w:t></w:t>
-      </w:r>
-      <w:r>
-        <w:rPr>
-          <w:rFonts w:ascii="Symbol" w:hAnsi="Symbol" w:cs="Symbol"/>
-          <w:color w:val="FF0000"/>
-        </w:rPr>
-        <w:t></w:t>
-      </w:r>
-      <w:r>
-        <w:rPr>
-          <w:rFonts w:cs="Arial"/>
-          <w:color w:val="FF0000"/>
-        </w:rPr>
-        <w:t>Deve ser composto no mínimo com 150 e no máximo com 500 palavras;</w:t>
-      </w:r>
-    </w:p>
-    <w:p>
-      <w:pPr>
-        <w:autoSpaceDE w:val="0"/>
-        <w:autoSpaceDN w:val="0"/>
-        <w:adjustRightInd w:val="0"/>
-        <w:spacing w:line="240" w:lineRule="auto"/>
-        <w:ind w:firstLine="0"/>
-        <w:jc w:val="left"/>
-        <w:rPr>
-          <w:rFonts w:cs="Arial"/>
-          <w:color w:val="FF0000"/>
-        </w:rPr>
-      </w:pPr>
-      <w:r>
-        <w:rPr>
-          <w:rFonts w:ascii="Symbol" w:hAnsi="Symbol" w:cs="Symbol"/>
-          <w:color w:val="FF0000"/>
-        </w:rPr>
-        <w:t></w:t>
-      </w:r>
-      <w:r>
-        <w:rPr>
-          <w:rFonts w:ascii="Symbol" w:hAnsi="Symbol" w:cs="Symbol"/>
-          <w:color w:val="FF0000"/>
-        </w:rPr>
-        <w:t></w:t>
-      </w:r>
-      <w:r>
-        <w:rPr>
-          <w:rFonts w:cs="Arial"/>
-          <w:color w:val="FF0000"/>
-        </w:rPr>
-        <w:t>No resumo devem ser ressaltados: o objetivo, o método, os resultados e as conclusões;</w:t>
-      </w:r>
-    </w:p>
-    <w:p>
-      <w:pPr>
-        <w:autoSpaceDE w:val="0"/>
-        <w:autoSpaceDN w:val="0"/>
-        <w:adjustRightInd w:val="0"/>
-        <w:spacing w:line="240" w:lineRule="auto"/>
-        <w:ind w:firstLine="0"/>
-        <w:jc w:val="left"/>
-        <w:rPr>
-          <w:rFonts w:cs="Arial"/>
-          <w:color w:val="FF0000"/>
-        </w:rPr>
-      </w:pPr>
-      <w:r>
-        <w:rPr>
-          <w:rFonts w:ascii="Symbol" w:hAnsi="Symbol" w:cs="Symbol"/>
-          <w:color w:val="FF0000"/>
-        </w:rPr>
-        <w:t></w:t>
-      </w:r>
-      <w:r>
-        <w:rPr>
-          <w:rFonts w:ascii="Symbol" w:hAnsi="Symbol" w:cs="Symbol"/>
-          <w:color w:val="FF0000"/>
-        </w:rPr>
-        <w:t></w:t>
-      </w:r>
-      <w:r>
-        <w:rPr>
-          <w:rFonts w:cs="Arial"/>
-          <w:color w:val="FF0000"/>
-        </w:rPr>
-        <w:t>Usar o verbo na voz ativa e na 3º pessoa do singular;</w:t>
-      </w:r>
-    </w:p>
-    <w:p>
-      <w:pPr>
-        <w:autoSpaceDE w:val="0"/>
-        <w:autoSpaceDN w:val="0"/>
-        <w:adjustRightInd w:val="0"/>
-        <w:spacing w:line="240" w:lineRule="auto"/>
-        <w:ind w:firstLine="0"/>
-        <w:jc w:val="left"/>
-        <w:rPr>
-          <w:rFonts w:cs="Arial"/>
-          <w:color w:val="FF0000"/>
-        </w:rPr>
-      </w:pPr>
-      <w:r>
-        <w:rPr>
-          <w:rFonts w:ascii="Symbol" w:hAnsi="Symbol" w:cs="Symbol"/>
-          <w:color w:val="FF0000"/>
-        </w:rPr>
-        <w:t></w:t>
-      </w:r>
-      <w:r>
-        <w:rPr>
-          <w:rFonts w:ascii="Symbol" w:hAnsi="Symbol" w:cs="Symbol"/>
-          <w:color w:val="FF0000"/>
-        </w:rPr>
-        <w:t></w:t>
-      </w:r>
-      <w:r>
-        <w:rPr>
-          <w:rFonts w:cs="Arial"/>
-          <w:color w:val="FF0000"/>
-        </w:rPr>
-        <w:t xml:space="preserve">Usar entrelinhamento </w:t>
-      </w:r>
-      <w:r>
-        <w:rPr>
-          <w:rFonts w:cs="Arial"/>
-          <w:b/>
-          <w:bCs/>
-          <w:color w:val="FF0000"/>
-        </w:rPr>
-        <w:t xml:space="preserve">simples </w:t>
-      </w:r>
-      <w:r>
-        <w:rPr>
-          <w:rFonts w:cs="Arial"/>
-          <w:color w:val="FF0000"/>
-        </w:rPr>
-        <w:t>e fonte igual à do texto;</w:t>
-      </w:r>
-    </w:p>
-    <w:p>
-      <w:pPr>
-        <w:autoSpaceDE w:val="0"/>
-        <w:autoSpaceDN w:val="0"/>
-        <w:adjustRightInd w:val="0"/>
-        <w:spacing w:line="240" w:lineRule="auto"/>
-        <w:ind w:firstLine="0"/>
-        <w:jc w:val="left"/>
-        <w:rPr>
-          <w:rFonts w:cs="Arial"/>
-          <w:color w:val="FF0000"/>
-        </w:rPr>
-      </w:pPr>
-      <w:r>
-        <w:rPr>
-          <w:rFonts w:ascii="Symbol" w:hAnsi="Symbol" w:cs="Symbol"/>
-          <w:color w:val="FF0000"/>
-        </w:rPr>
-        <w:t></w:t>
-      </w:r>
-      <w:r>
-        <w:rPr>
-          <w:rFonts w:ascii="Symbol" w:hAnsi="Symbol" w:cs="Symbol"/>
-          <w:color w:val="FF0000"/>
-        </w:rPr>
-        <w:t></w:t>
-      </w:r>
-      <w:r>
-        <w:rPr>
-          <w:rFonts w:cs="Arial"/>
-          <w:color w:val="FF0000"/>
-        </w:rPr>
-        <w:t>Usando 2 espaço de 1,5 separando a palavra resumo do texto;</w:t>
-      </w:r>
-    </w:p>
-    <w:p>
-      <w:pPr>
-        <w:autoSpaceDE w:val="0"/>
-        <w:autoSpaceDN w:val="0"/>
-        <w:adjustRightInd w:val="0"/>
-        <w:spacing w:line="240" w:lineRule="auto"/>
-        <w:ind w:firstLine="0"/>
-        <w:jc w:val="left"/>
-        <w:rPr>
-          <w:rFonts w:cs="Arial"/>
-          <w:color w:val="FF0000"/>
-        </w:rPr>
-      </w:pPr>
-      <w:r>
-        <w:rPr>
-          <w:rFonts w:ascii="Symbol" w:hAnsi="Symbol" w:cs="Symbol"/>
-          <w:color w:val="FF0000"/>
-        </w:rPr>
-        <w:t></w:t>
-      </w:r>
-      <w:r>
-        <w:rPr>
-          <w:rFonts w:ascii="Symbol" w:hAnsi="Symbol" w:cs="Symbol"/>
-          <w:color w:val="FF0000"/>
-        </w:rPr>
-        <w:t></w:t>
-      </w:r>
-      <w:r>
-        <w:rPr>
-          <w:rFonts w:cs="Arial"/>
-          <w:color w:val="FF0000"/>
-        </w:rPr>
-        <w:t>Com 1 espaços de 1,5 separando o resumo das palavras chave;</w:t>
-      </w:r>
-    </w:p>
-    <w:p>
-      <w:pPr>
-        <w:ind w:firstLine="0"/>
-        <w:jc w:val="left"/>
-        <w:rPr>
-          <w:rFonts w:cs="Arial"/>
-          <w:color w:val="FF0000"/>
-        </w:rPr>
-      </w:pPr>
-      <w:r>
-        <w:rPr>
-          <w:rFonts w:ascii="Symbol" w:hAnsi="Symbol" w:cs="Symbol"/>
-          <w:color w:val="FF0000"/>
-        </w:rPr>
-        <w:t></w:t>
-      </w:r>
-      <w:r>
-        <w:rPr>
-          <w:rFonts w:ascii="Symbol" w:hAnsi="Symbol" w:cs="Symbol"/>
-          <w:color w:val="FF0000"/>
-        </w:rPr>
-        <w:t></w:t>
-      </w:r>
-      <w:r>
-        <w:rPr>
-          <w:rFonts w:cs="Arial"/>
-          <w:color w:val="FF0000"/>
-        </w:rPr>
-        <w:t xml:space="preserve">Alinhamento a esquerda sem recuo de parágrafo; </w:t>
-      </w:r>
-    </w:p>
-    <w:p>
-      <w:pPr>
-        <w:ind w:firstLine="0"/>
-        <w:jc w:val="left"/>
-        <w:rPr>
-          <w:bCs/>
-          <w:color w:val="FF0000"/>
-        </w:rPr>
-      </w:pPr>
-    </w:p>
-    <w:p>
-      <w:pPr>
-        <w:autoSpaceDE w:val="0"/>
-        <w:autoSpaceDN w:val="0"/>
-        <w:adjustRightInd w:val="0"/>
-        <w:spacing w:line="240" w:lineRule="auto"/>
-        <w:ind w:firstLine="0"/>
-        <w:jc w:val="left"/>
-        <w:rPr>
-          <w:rFonts w:cs="Arial"/>
-          <w:b/>
-          <w:bCs/>
-          <w:color w:val="FF0000"/>
-        </w:rPr>
-      </w:pPr>
-      <w:r>
-        <w:rPr>
-          <w:rFonts w:cs="Arial"/>
-          <w:b/>
-          <w:bCs/>
-          <w:color w:val="FF0000"/>
-        </w:rPr>
-        <w:t>Atenção</w:t>
-      </w:r>
-    </w:p>
-    <w:p>
-      <w:pPr>
-        <w:ind w:firstLine="0"/>
-        <w:jc w:val="left"/>
-        <w:rPr>
-          <w:bCs/>
-          <w:color w:val="FF0000"/>
-        </w:rPr>
-      </w:pPr>
-      <w:r>
-        <w:rPr>
-          <w:rFonts w:cs="Arial"/>
-          <w:color w:val="FF0000"/>
-        </w:rPr>
-        <w:t>Para o “Abstract” utilizar as mesmas orientações do resumo.</w:t>
-      </w:r>
-      <w:r>
-        <w:rPr>
-          <w:bCs/>
-          <w:color w:val="FF0000"/>
-        </w:rPr>
-        <w:t xml:space="preserve"> </w:t>
+          <w:b/>
+          <w:bCs/>
+          <w:lang w:val="en-US"/>
+        </w:rPr>
+      </w:pPr>
+      <w:r>
+        <w:rPr>
+          <w:rFonts w:cs="Arial"/>
+          <w:b/>
+          <w:bCs/>
+          <w:lang w:val="en-US"/>
+        </w:rPr>
+        <w:br w:type="page"/>
       </w:r>
     </w:p>
     <w:p>
@@ -2554,76 +2042,6 @@
         <w:ind w:firstLine="0"/>
         <w:jc w:val="center"/>
         <w:rPr>
-          <w:bCs/>
-          <w:color w:val="FF0000"/>
-        </w:rPr>
-      </w:pPr>
-    </w:p>
-    <w:p>
-      <w:pPr>
-        <w:ind w:firstLine="0"/>
-        <w:jc w:val="center"/>
-        <w:rPr>
-          <w:bCs/>
-          <w:color w:val="FF0000"/>
-        </w:rPr>
-      </w:pPr>
-    </w:p>
-    <w:p>
-      <w:pPr>
-        <w:ind w:firstLine="0"/>
-        <w:jc w:val="center"/>
-        <w:rPr>
-          <w:bCs/>
-          <w:color w:val="FF0000"/>
-        </w:rPr>
-      </w:pPr>
-    </w:p>
-    <w:p>
-      <w:pPr>
-        <w:ind w:firstLine="0"/>
-        <w:jc w:val="center"/>
-        <w:rPr>
-          <w:bCs/>
-          <w:color w:val="FF0000"/>
-        </w:rPr>
-      </w:pPr>
-    </w:p>
-    <w:p>
-      <w:pPr>
-        <w:ind w:firstLine="0"/>
-        <w:jc w:val="center"/>
-        <w:rPr>
-          <w:bCs/>
-          <w:color w:val="FF0000"/>
-        </w:rPr>
-      </w:pPr>
-    </w:p>
-    <w:p>
-      <w:pPr>
-        <w:ind w:firstLine="0"/>
-        <w:jc w:val="center"/>
-        <w:rPr>
-          <w:bCs/>
-          <w:color w:val="FF0000"/>
-        </w:rPr>
-      </w:pPr>
-    </w:p>
-    <w:p>
-      <w:pPr>
-        <w:ind w:firstLine="0"/>
-        <w:jc w:val="center"/>
-        <w:rPr>
-          <w:bCs/>
-          <w:color w:val="FF0000"/>
-        </w:rPr>
-      </w:pPr>
-    </w:p>
-    <w:p>
-      <w:pPr>
-        <w:ind w:firstLine="0"/>
-        <w:jc w:val="center"/>
-        <w:rPr>
           <w:rFonts w:cs="Arial"/>
           <w:b/>
           <w:bCs/>
@@ -2637,6 +2055,7 @@
           <w:bCs/>
           <w:lang w:val="en-US"/>
         </w:rPr>
+        <w:lastRenderedPageBreak/>
         <w:t>ABSTRACT</w:t>
       </w:r>
     </w:p>
@@ -3233,7 +2652,25 @@
                 <w:bCs/>
                 <w:szCs w:val="23"/>
               </w:rPr>
-              <w:t>Elementos pré-textuais</w:t>
+              <w:t xml:space="preserve">Elementos </w:t>
+            </w:r>
+            <w:proofErr w:type="spellStart"/>
+            <w:r>
+              <w:rPr>
+                <w:rFonts w:ascii="Arial" w:hAnsi="Arial" w:cs="Arial"/>
+                <w:bCs/>
+                <w:szCs w:val="23"/>
+              </w:rPr>
+              <w:t>pré</w:t>
+            </w:r>
+            <w:proofErr w:type="spellEnd"/>
+            <w:r>
+              <w:rPr>
+                <w:rFonts w:ascii="Arial" w:hAnsi="Arial" w:cs="Arial"/>
+                <w:bCs/>
+                <w:szCs w:val="23"/>
+              </w:rPr>
+              <w:t>-textuais</w:t>
             </w:r>
           </w:p>
         </w:tc>
@@ -4137,6 +3574,7 @@
               <w:ind w:firstLine="0"/>
               <w:jc w:val="left"/>
             </w:pPr>
+            <w:proofErr w:type="spellStart"/>
             <w:r>
               <w:rPr>
                 <w:rStyle w:val="nfase"/>
@@ -4144,8 +3582,29 @@
                 <w:sz w:val="23"/>
                 <w:szCs w:val="23"/>
               </w:rPr>
-              <w:t>Read-Only Memory</w:t>
+              <w:t>Read</w:t>
             </w:r>
+            <w:proofErr w:type="spellEnd"/>
+            <w:r>
+              <w:rPr>
+                <w:rStyle w:val="nfase"/>
+                <w:i w:val="0"/>
+                <w:sz w:val="23"/>
+                <w:szCs w:val="23"/>
+              </w:rPr>
+              <w:t xml:space="preserve">-Only </w:t>
+            </w:r>
+            <w:proofErr w:type="spellStart"/>
+            <w:r>
+              <w:rPr>
+                <w:rStyle w:val="nfase"/>
+                <w:i w:val="0"/>
+                <w:sz w:val="23"/>
+                <w:szCs w:val="23"/>
+              </w:rPr>
+              <w:t>Memory</w:t>
+            </w:r>
+            <w:proofErr w:type="spellEnd"/>
           </w:p>
         </w:tc>
       </w:tr>
@@ -4184,8 +3643,18 @@
                 <w:i w:val="0"/>
                 <w:szCs w:val="23"/>
               </w:rPr>
-              <w:t>Random-Access Memory</w:t>
+              <w:t xml:space="preserve">Random-Access </w:t>
             </w:r>
+            <w:proofErr w:type="spellStart"/>
+            <w:r>
+              <w:rPr>
+                <w:rStyle w:val="nfase"/>
+                <w:i w:val="0"/>
+                <w:szCs w:val="23"/>
+              </w:rPr>
+              <w:t>Memory</w:t>
+            </w:r>
+            <w:proofErr w:type="spellEnd"/>
           </w:p>
         </w:tc>
       </w:tr>
@@ -4215,9 +3684,27 @@
               <w:ind w:firstLine="0"/>
               <w:jc w:val="left"/>
             </w:pPr>
+            <w:proofErr w:type="spellStart"/>
             <w:r>
-              <w:t>Cascading Style Sheets</w:t>
+              <w:t>Cascading</w:t>
             </w:r>
+            <w:proofErr w:type="spellEnd"/>
+            <w:r>
+              <w:t xml:space="preserve"> </w:t>
+            </w:r>
+            <w:proofErr w:type="spellStart"/>
+            <w:r>
+              <w:t>Style</w:t>
+            </w:r>
+            <w:proofErr w:type="spellEnd"/>
+            <w:r>
+              <w:t xml:space="preserve"> </w:t>
+            </w:r>
+            <w:proofErr w:type="spellStart"/>
+            <w:r>
+              <w:t>Sheets</w:t>
+            </w:r>
+            <w:proofErr w:type="spellEnd"/>
           </w:p>
         </w:tc>
       </w:tr>
@@ -4247,9 +3734,19 @@
               <w:ind w:firstLine="0"/>
               <w:jc w:val="left"/>
             </w:pPr>
+            <w:proofErr w:type="spellStart"/>
             <w:r>
-              <w:t>HyperText Markup Language</w:t>
+              <w:t>HyperText</w:t>
             </w:r>
+            <w:proofErr w:type="spellEnd"/>
+            <w:r>
+              <w:t xml:space="preserve"> Markup </w:t>
+            </w:r>
+            <w:proofErr w:type="spellStart"/>
+            <w:r>
+              <w:t>Language</w:t>
+            </w:r>
+            <w:proofErr w:type="spellEnd"/>
           </w:p>
         </w:tc>
       </w:tr>
@@ -4466,8 +3963,13 @@
               <w:ind w:firstLine="0"/>
               <w:jc w:val="left"/>
             </w:pPr>
+            <w:proofErr w:type="spellStart"/>
             <w:r>
-              <w:t>div.</w:t>
+              <w:t>div</w:t>
+            </w:r>
+            <w:proofErr w:type="spellEnd"/>
+            <w:r>
+              <w:t>.</w:t>
             </w:r>
           </w:p>
         </w:tc>
@@ -6407,7 +5909,10 @@
         <w:ind w:firstLine="851"/>
       </w:pPr>
       <w:r>
-        <w:t>É a parte inicial do trabalho e tem a finalidade de dar ao leitor uma visão clara e simples do assunto do trabalho.</w:t>
+        <w:t xml:space="preserve">Com o avanço da tecnologia da informação, muitas empresas passaram a utilizar sistemas para auxiliar na organização e no gerenciamento de dados. Esses sistemas permitem armazenar, processar e consultar informações de forma mais rápida e segura, contribuindo para a melhoria da gestão </w:t>
+      </w:r>
+      <w:r>
+        <w:t>de produtos.</w:t>
       </w:r>
     </w:p>
     <w:p>
@@ -6415,10 +5920,13 @@
         <w:ind w:firstLine="851"/>
       </w:pPr>
       <w:r>
-        <w:t>Segundo a as Normas para apresentação de trabalhos científicos da UFPR (2012), é</w:t>
-      </w:r>
-      <w:r>
-        <w:t xml:space="preserve"> parte inicial do texto em que o assunto é apresentado como um todo, sem grandes detalhes. Trata-se de um recurso explicativo do autor para o leitor. Por isso, é importante que a introdução apresente a delimitação do assunto tratado, os objetivos da pesquisa e outros elementos necessários que situem o tema do trabalho, como por exemplo: o universo da pesquisa, o problema, a justificativa e uma breve apresentação dos capítulos do trabalho.</w:t>
+        <w:t>No setor d</w:t>
+      </w:r>
+      <w:r>
+        <w:t>e padarias e panificadoras</w:t>
+      </w:r>
+      <w:r>
+        <w:t xml:space="preserve">, a administração eficiente de dados relacionados a funcionários, fornecedores e produtos é fundamental para o bom funcionamento do negócio. Muitas padarias ainda utilizam métodos manuais ou planilhas simples para controlar essas informações, o que pode gerar erros, perda de dados e dificuldades na organização. </w:t>
       </w:r>
     </w:p>
     <w:p>
@@ -6426,14 +5934,10 @@
         <w:ind w:firstLine="851"/>
       </w:pPr>
       <w:r>
-        <w:t xml:space="preserve">De acordo com Cervo (2002), os requisitos indispensáveis na introdução de um trabalho científico são: </w:t>
-      </w:r>
-      <w:r>
-        <w:rPr>
-          <w:b/>
-          <w:color w:val="FF0000"/>
-        </w:rPr>
-        <w:t>definição do tema, indicação do problema e da hipótese, a indicação da metodologia a ser seguida e a estrutura interna do trabalho, com indicação de como estão distribuídos e organizados os seus argumentos.</w:t>
+        <w:t>Em meio a esse contexto,</w:t>
+      </w:r>
+      <w:r>
+        <w:t xml:space="preserve"> surge a necessidade de desenvolver um sistema de cadastro que permita registrar e gerenciar essas informações de maneira estruturada. O sistema proposto busca facilitar o controle dos dados da padaria por meio de uma interface simples e funcional. </w:t>
       </w:r>
     </w:p>
     <w:p>
@@ -6441,17 +5945,10 @@
         <w:ind w:firstLine="851"/>
       </w:pPr>
       <w:r>
-        <w:t xml:space="preserve">A introdução não deve, </w:t>
-      </w:r>
-      <w:r>
-        <w:rPr>
-          <w:b/>
-          <w:color w:val="FF0000"/>
-        </w:rPr>
-        <w:t>entretanto, repetir ou parafrasear o resumo</w:t>
-      </w:r>
-      <w:r>
-        <w:t>, nem dar os dados sobre a teoria experimental, o método ou os resultados, nem antecipar as conclusões e as recomendações contidas ou decorrentes no estudo (NBR 10719). Na introdução deverá ser abordado o tema, as hipóteses, o objetivo geral e os específicos e a justificativa.</w:t>
+        <w:t>Este trabalho apresenta o desenvolvimento de um sistema de cadastro para funcionários, fornecedores e produtos de uma padaria, abordando os conceitos teóricos</w:t>
+      </w:r>
+      <w:r>
+        <w:t xml:space="preserve"> vistos em aula.</w:t>
       </w:r>
     </w:p>
     <w:p>
@@ -7213,7 +6710,15 @@
         <w:ind w:firstLine="851"/>
       </w:pPr>
       <w:r>
-        <w:t>Nesta seção deve constar a relação entre as tecnologias utilizadas (ferramentas, linguagens, programas, equipamentos, etc) e sua aplicação nas etapas do trabalho. Pode ser feita como uma lista de itens ou uma tabela, conforme o exemplo a seguir.</w:t>
+        <w:t xml:space="preserve">Nesta seção deve constar a relação entre as tecnologias utilizadas (ferramentas, linguagens, programas, equipamentos, </w:t>
+      </w:r>
+      <w:proofErr w:type="spellStart"/>
+      <w:r>
+        <w:t>etc</w:t>
+      </w:r>
+      <w:proofErr w:type="spellEnd"/>
+      <w:r>
+        <w:t>) e sua aplicação nas etapas do trabalho. Pode ser feita como uma lista de itens ou uma tabela, conforme o exemplo a seguir.</w:t>
       </w:r>
     </w:p>
     <w:tbl>
@@ -7531,7 +7036,23 @@
           <w:caps w:val="0"/>
           <w:color w:val="FF0000"/>
         </w:rPr>
-        <w:t>Nesse item você deve fazer um breve relato sobre  requisitos Funcionais e não funcionais</w:t>
+        <w:t xml:space="preserve">Nesse item você deve fazer um breve relato </w:t>
+      </w:r>
+      <w:proofErr w:type="gramStart"/>
+      <w:r>
+        <w:rPr>
+          <w:caps w:val="0"/>
+          <w:color w:val="FF0000"/>
+        </w:rPr>
+        <w:t>sobre  requisitos</w:t>
+      </w:r>
+      <w:proofErr w:type="gramEnd"/>
+      <w:r>
+        <w:rPr>
+          <w:caps w:val="0"/>
+          <w:color w:val="FF0000"/>
+        </w:rPr>
+        <w:t xml:space="preserve"> Funcionais e não funcionais</w:t>
       </w:r>
       <w:r>
         <w:rPr>
@@ -7851,13 +7372,27 @@
         <w:rPr>
           <w:color w:val="FF0000"/>
         </w:rPr>
-        <w:t xml:space="preserve">, coloque imagem </w:t>
-      </w:r>
-      <w:r>
-        <w:rPr>
-          <w:color w:val="FF0000"/>
-        </w:rPr>
-        <w:t>!)</w:t>
+        <w:t xml:space="preserve">, coloque </w:t>
+      </w:r>
+      <w:proofErr w:type="gramStart"/>
+      <w:r>
+        <w:rPr>
+          <w:color w:val="FF0000"/>
+        </w:rPr>
+        <w:t xml:space="preserve">imagem </w:t>
+      </w:r>
+      <w:r>
+        <w:rPr>
+          <w:color w:val="FF0000"/>
+        </w:rPr>
+        <w:t>!</w:t>
+      </w:r>
+      <w:proofErr w:type="gramEnd"/>
+      <w:r>
+        <w:rPr>
+          <w:color w:val="FF0000"/>
+        </w:rPr>
+        <w:t>)</w:t>
       </w:r>
       <w:r>
         <w:t xml:space="preserve"> </w:t>
@@ -8044,13 +7579,24 @@
         </w:numPr>
       </w:pPr>
       <w:r>
-        <w:t>Interface do Sistema (</w:t>
-      </w:r>
-      <w:r>
-        <w:rPr>
-          <w:color w:val="FF0000"/>
-        </w:rPr>
-        <w:t xml:space="preserve"> Telas do sistema, seja </w:t>
+        <w:t xml:space="preserve">Interface do Sistema </w:t>
+      </w:r>
+      <w:proofErr w:type="gramStart"/>
+      <w:r>
+        <w:t>(</w:t>
+      </w:r>
+      <w:r>
+        <w:rPr>
+          <w:color w:val="FF0000"/>
+        </w:rPr>
+        <w:t xml:space="preserve"> Telas</w:t>
+      </w:r>
+      <w:proofErr w:type="gramEnd"/>
+      <w:r>
+        <w:rPr>
+          <w:color w:val="FF0000"/>
+        </w:rPr>
+        <w:t xml:space="preserve"> do sistema, seja </w:t>
       </w:r>
       <w:r>
         <w:rPr>
@@ -8072,8 +7618,13 @@
           <w:numId w:val="3"/>
         </w:numPr>
       </w:pPr>
-      <w:r>
-        <w:t>Screenshots das páginas</w:t>
+      <w:proofErr w:type="spellStart"/>
+      <w:r>
+        <w:t>Screenshots</w:t>
+      </w:r>
+      <w:proofErr w:type="spellEnd"/>
+      <w:r>
+        <w:t xml:space="preserve"> das páginas</w:t>
       </w:r>
     </w:p>
     <w:p>
@@ -8331,7 +7882,31 @@
         <w:t>A arena científica. Ciência da Informação</w:t>
       </w:r>
       <w:r>
-        <w:t>, Brasília, v. 24, n. 2, 1995. Recensões. Disponível em:&lt;http://www.ibict.br/cionline/inicio.htm&gt;. Acesso em: 16 dez. 2003.</w:t>
+        <w:t>, Brasília, v. 24, n. 2, 1995. Recensões. Disponível em:&lt;http://www.ibict.br/</w:t>
+      </w:r>
+      <w:proofErr w:type="spellStart"/>
+      <w:r>
+        <w:t>cionline</w:t>
+      </w:r>
+      <w:proofErr w:type="spellEnd"/>
+      <w:r>
+        <w:t>/</w:t>
+      </w:r>
+      <w:proofErr w:type="spellStart"/>
+      <w:r>
+        <w:t>inicio</w:t>
+      </w:r>
+      <w:proofErr w:type="spellEnd"/>
+      <w:r>
+        <w:t>.</w:t>
+      </w:r>
+      <w:proofErr w:type="spellStart"/>
+      <w:r>
+        <w:t>htm</w:t>
+      </w:r>
+      <w:proofErr w:type="spellEnd"/>
+      <w:r>
+        <w:t>&gt;. Acesso em: 16 dez. 2003.</w:t>
       </w:r>
     </w:p>
     <w:p>
@@ -8359,15 +7934,19 @@
       <w:r>
         <w:t xml:space="preserve">ção e Negócios). Tradução de: Business </w:t>
       </w:r>
+      <w:proofErr w:type="spellStart"/>
       <w:r>
         <w:t>process</w:t>
       </w:r>
+      <w:proofErr w:type="spellEnd"/>
       <w:r>
         <w:t xml:space="preserve"> </w:t>
       </w:r>
+      <w:proofErr w:type="spellStart"/>
       <w:r>
         <w:t>reengineering</w:t>
       </w:r>
+      <w:proofErr w:type="spellEnd"/>
       <w:r>
         <w:t>.</w:t>
       </w:r>
@@ -8696,7 +8275,47 @@
           <w:bCs/>
           <w:color w:val="FF0000"/>
         </w:rPr>
-        <w:t xml:space="preserve"> aqui deveficar: Entrevista, Códigos Programação WEB , Códigos SQL</w:t>
+        <w:t xml:space="preserve"> aqui </w:t>
+      </w:r>
+      <w:proofErr w:type="spellStart"/>
+      <w:r>
+        <w:rPr>
+          <w:rFonts w:cs="Arial"/>
+          <w:b/>
+          <w:bCs/>
+          <w:color w:val="FF0000"/>
+        </w:rPr>
+        <w:t>deveficar</w:t>
+      </w:r>
+      <w:proofErr w:type="spellEnd"/>
+      <w:r>
+        <w:rPr>
+          <w:rFonts w:cs="Arial"/>
+          <w:b/>
+          <w:bCs/>
+          <w:color w:val="FF0000"/>
+        </w:rPr>
+        <w:t xml:space="preserve">: Entrevista, Códigos Programação </w:t>
+      </w:r>
+      <w:proofErr w:type="gramStart"/>
+      <w:r>
+        <w:rPr>
+          <w:rFonts w:cs="Arial"/>
+          <w:b/>
+          <w:bCs/>
+          <w:color w:val="FF0000"/>
+        </w:rPr>
+        <w:t>WEB ,</w:t>
+      </w:r>
+      <w:proofErr w:type="gramEnd"/>
+      <w:r>
+        <w:rPr>
+          <w:rFonts w:cs="Arial"/>
+          <w:b/>
+          <w:bCs/>
+          <w:color w:val="FF0000"/>
+        </w:rPr>
+        <w:t xml:space="preserve"> Códigos SQL</w:t>
       </w:r>
       <w:r>
         <w:rPr>
@@ -9693,7 +9312,21 @@
         <w:rPr>
           <w:rFonts w:cs="Arial"/>
         </w:rPr>
-        <w:t xml:space="preserve">Tonetto e Reck (2001, p. 134) destacam: "Este autoconhecimento pressupõe conhecer seus limites [...]" </w:t>
+        <w:t xml:space="preserve">Tonetto e </w:t>
+      </w:r>
+      <w:proofErr w:type="spellStart"/>
+      <w:r>
+        <w:rPr>
+          <w:rFonts w:cs="Arial"/>
+        </w:rPr>
+        <w:t>Reck</w:t>
+      </w:r>
+      <w:proofErr w:type="spellEnd"/>
+      <w:r>
+        <w:rPr>
+          <w:rFonts w:cs="Arial"/>
+        </w:rPr>
+        <w:t xml:space="preserve"> (2001, p. 134) destacam: "Este autoconhecimento pressupõe conhecer seus limites [...]" </w:t>
       </w:r>
     </w:p>
     <w:p>
@@ -9823,7 +9456,21 @@
           <w:rFonts w:cs="Arial"/>
         </w:rPr>
         <w:lastRenderedPageBreak/>
-        <w:t>O movimento social, com o intuito de realizar uma transformação social, é uma das tarefas mais importantes da atualidades (O COOPERATIVISMO..., 2002).</w:t>
+        <w:t xml:space="preserve">O movimento social, com o intuito de realizar uma transformação social, é uma das tarefas mais importantes </w:t>
+      </w:r>
+      <w:proofErr w:type="gramStart"/>
+      <w:r>
+        <w:rPr>
+          <w:rFonts w:cs="Arial"/>
+        </w:rPr>
+        <w:t>da atualidades</w:t>
+      </w:r>
+      <w:proofErr w:type="gramEnd"/>
+      <w:r>
+        <w:rPr>
+          <w:rFonts w:cs="Arial"/>
+        </w:rPr>
+        <w:t xml:space="preserve"> (O COOPERATIVISMO..., 2002).</w:t>
       </w:r>
     </w:p>
     <w:p>
@@ -10307,7 +9954,15 @@
               <w:pStyle w:val="Contedotabelaequadro"/>
             </w:pPr>
             <w:r>
-              <w:t xml:space="preserve">Fonte: Sen (2000, p. 240). </w:t>
+              <w:t xml:space="preserve">Fonte: </w:t>
+            </w:r>
+            <w:proofErr w:type="spellStart"/>
+            <w:r>
+              <w:t>Sen</w:t>
+            </w:r>
+            <w:proofErr w:type="spellEnd"/>
+            <w:r>
+              <w:t xml:space="preserve"> (2000, p. 240). </w:t>
             </w:r>
           </w:p>
         </w:tc>

</xml_diff>